<commit_message>
feat: add real-time chat learning app
Amp-Thread-ID: https://ampcode.com/threads/T-01a058ed-9faf-73d8-b500-dfd7e90d2438
</commit_message>
<xml_diff>
--- a/docs/AZURE_GENAI_BEGINNER_HANDBOOK.docx
+++ b/docs/AZURE_GENAI_BEGINNER_HANDBOOK.docx
@@ -228,7 +228,7 @@
         <w:t>Current delivery status:</w:t>
       </w:r>
       <w:r>
-        <w:t xml:space="preserve"> this is the teaching and design handbook. The existing</w:t>
+        <w:t xml:space="preserve"> the existing Feedback Analyzer, local Docker stack, CI</w:t>
       </w:r>
     </w:p>
     <w:p>
@@ -237,7 +237,7 @@
         <w:shd w:fill="FFF4DF"/>
       </w:pPr>
       <w:r>
-        <w:t>Feedback Analyzer, local Docker stack, CI checks, and GHCR images are implemented. The</w:t>
+        <w:t>checks, and GHCR images are implemented. App 1 now has a working React Chat page,</w:t>
       </w:r>
     </w:p>
     <w:p>
@@ -246,7 +246,7 @@
         <w:shd w:fill="FFF4DF"/>
       </w:pPr>
       <w:r>
-        <w:t>three new learning applications and their Azure resources are planned but have not yet</w:t>
+        <w:t>dedicated FastAPI entry point, fake/Azure provider seam, scoped cache key, TTL cache,</w:t>
       </w:r>
     </w:p>
     <w:p>
@@ -255,7 +255,25 @@
         <w:shd w:fill="FFF4DF"/>
       </w:pPr>
       <w:r>
-        <w:t>been implemented or deployed. Planned behavior must not be mistaken for completed work.</w:t>
+        <w:t>Redis-compatible distributed lock, managed-identity model authentication path, and</w:t>
+      </w:r>
+    </w:p>
+    <w:p>
+      <w:pPr>
+        <w:pStyle w:val="Quote"/>
+        <w:shd w:fill="FFF4DF"/>
+      </w:pPr>
+      <w:r>
+        <w:t>local tests. Its Azure resources are not yet deployed. Apps 2 and 3 remain planned.</w:t>
+      </w:r>
+    </w:p>
+    <w:p>
+      <w:pPr>
+        <w:pStyle w:val="Quote"/>
+        <w:shd w:fill="FFF4DF"/>
+      </w:pPr>
+      <w:r>
+        <w:t>Local behavior must not be mistaken for a cloud deployment.</w:t>
       </w:r>
     </w:p>
     <w:p>
@@ -944,6 +962,53 @@
       </w:pPr>
       <w:r>
         <w:t>4. App 1 — Real-time Chat, explained from click to response</w:t>
+      </w:r>
+    </w:p>
+    <w:p>
+      <w:r>
+        <w:rPr>
+          <w:b/>
+        </w:rPr>
+        <w:t>Implementation checkpoint:</w:t>
+      </w:r>
+      <w:r>
+        <w:t xml:space="preserve"> the local fake-provider version of this flow is now implemented in </w:t>
+      </w:r>
+      <w:r>
+        <w:rPr>
+          <w:rStyle w:val="InlineCode"/>
+        </w:rPr>
+        <w:t>frontend/src/pages/ChatPage.tsx</w:t>
+      </w:r>
+      <w:r>
+        <w:t xml:space="preserve">, </w:t>
+      </w:r>
+      <w:r>
+        <w:rPr>
+          <w:rStyle w:val="InlineCode"/>
+        </w:rPr>
+        <w:t>backend/app/chat_api.py</w:t>
+      </w:r>
+      <w:r>
+        <w:t xml:space="preserve">, </w:t>
+      </w:r>
+      <w:r>
+        <w:rPr>
+          <w:rStyle w:val="InlineCode"/>
+        </w:rPr>
+        <w:t>backend/app/chat.py</w:t>
+      </w:r>
+      <w:r>
+        <w:t xml:space="preserve">, and </w:t>
+      </w:r>
+      <w:r>
+        <w:rPr>
+          <w:rStyle w:val="InlineCode"/>
+        </w:rPr>
+        <w:t>backend/app/chat_cache.py</w:t>
+      </w:r>
+      <w:r>
+        <w:t>. The test suite proves MISS→HIT, zero hit tokens, TTL expiry, cache-key boundaries, and one provider call for 20 concurrent identical misses. The next checkpoint is manual Azure service creation and deployment.</w:t>
       </w:r>
     </w:p>
     <w:p>

</xml_diff>